<commit_message>
docs: bo sung so do dong dieu khien vao bang san pham ban giao
Rebase len main keo ve hai commit cua Vong Minh Quan ngay 09/09, trong do co
docs/CFG_White-box_CareerCompass.drawio — so do dong dieu khien phuc vu phan
tich hop trang, 30 KB.

Day la mot san pham ban giao that cua phan hop trang nhung chua co trong bang
san pham cua bao cao Word. Them vao de khong bo sot dong gop.
</commit_message>
<xml_diff>
--- a/BaoCao-CongViec-Theo-Tuan.docx
+++ b/BaoCao-CongViec-Theo-Tuan.docx
@@ -410,7 +410,7 @@
                 <w:rFonts w:ascii="Times New Roman" w:hAnsi="Times New Roman"/>
                 <w:sz w:val="24"/>
               </w:rPr>
-              <w:t>74 commit</w:t>
+              <w:t>77 commit</w:t>
             </w:r>
           </w:p>
         </w:tc>
@@ -1400,7 +1400,7 @@
                 <w:rFonts w:ascii="Times New Roman" w:hAnsi="Times New Roman"/>
                 <w:sz w:val="24"/>
               </w:rPr>
-              <w:t>5</w:t>
+              <w:t>8</w:t>
             </w:r>
           </w:p>
         </w:tc>
@@ -1417,7 +1417,7 @@
                 <w:rFonts w:ascii="Times New Roman" w:hAnsi="Times New Roman"/>
                 <w:sz w:val="24"/>
               </w:rPr>
-              <w:t>55</w:t>
+              <w:t>59</w:t>
             </w:r>
           </w:p>
         </w:tc>
@@ -1434,7 +1434,7 @@
                 <w:rFonts w:ascii="Times New Roman" w:hAnsi="Times New Roman"/>
                 <w:sz w:val="24"/>
               </w:rPr>
-              <w:t>3.449</w:t>
+              <w:t>3.877</w:t>
             </w:r>
           </w:p>
         </w:tc>
@@ -1502,7 +1502,7 @@
                 <w:rFonts w:ascii="Times New Roman" w:hAnsi="Times New Roman"/>
                 <w:sz w:val="24"/>
               </w:rPr>
-              <w:t>74</w:t>
+              <w:t>77</w:t>
             </w:r>
           </w:p>
         </w:tc>
@@ -1535,7 +1535,7 @@
                 <w:rFonts w:ascii="Times New Roman" w:hAnsi="Times New Roman"/>
                 <w:sz w:val="24"/>
               </w:rPr>
-              <w:t>39.833</w:t>
+              <w:t>40.261</w:t>
             </w:r>
           </w:p>
         </w:tc>
@@ -1700,7 +1700,7 @@
                 <w:rFonts w:ascii="Times New Roman" w:hAnsi="Times New Roman"/>
                 <w:sz w:val="24"/>
               </w:rPr>
-              <w:t>53</w:t>
+              <w:t>54</w:t>
             </w:r>
           </w:p>
         </w:tc>
@@ -1753,7 +1753,7 @@
                 <w:rFonts w:ascii="Times New Roman" w:hAnsi="Times New Roman"/>
                 <w:sz w:val="24"/>
               </w:rPr>
-              <w:t>19</w:t>
+              <w:t>21</w:t>
             </w:r>
           </w:p>
         </w:tc>
@@ -4032,6 +4032,59 @@
                 <w:rFonts w:ascii="Times New Roman" w:hAnsi="Times New Roman"/>
                 <w:sz w:val="22"/>
               </w:rPr>
+              <w:t>docs/CFG_White-box_CareerCompass.drawio</w:t>
+            </w:r>
+          </w:p>
+        </w:tc>
+        <w:tc>
+          <w:tcPr>
+            <w:tcW w:type="dxa" w:w="3061"/>
+          </w:tcPr>
+          <w:p>
+            <w:pPr>
+              <w:jc w:val="left"/>
+            </w:pPr>
+            <w:r>
+              <w:rPr>
+                <w:rFonts w:ascii="Times New Roman" w:hAnsi="Times New Roman"/>
+                <w:sz w:val="22"/>
+              </w:rPr>
+              <w:t>Sơ đồ dòng điều khiển phục vụ phân tích hộp trắng</w:t>
+            </w:r>
+          </w:p>
+        </w:tc>
+        <w:tc>
+          <w:tcPr>
+            <w:tcW w:type="dxa" w:w="2494"/>
+          </w:tcPr>
+          <w:p>
+            <w:pPr>
+              <w:jc w:val="left"/>
+            </w:pPr>
+            <w:r>
+              <w:rPr>
+                <w:rFonts w:ascii="Times New Roman" w:hAnsi="Times New Roman"/>
+                <w:sz w:val="22"/>
+              </w:rPr>
+              <w:t>Vòng Minh Quân</w:t>
+            </w:r>
+          </w:p>
+        </w:tc>
+      </w:tr>
+      <w:tr>
+        <w:tc>
+          <w:tcPr>
+            <w:tcW w:type="dxa" w:w="2948"/>
+          </w:tcPr>
+          <w:p>
+            <w:pPr>
+              <w:jc w:val="left"/>
+            </w:pPr>
+            <w:r>
+              <w:rPr>
+                <w:rFonts w:ascii="Times New Roman" w:hAnsi="Times New Roman"/>
+                <w:sz w:val="22"/>
+              </w:rPr>
               <w:t>SoDo-ChuyenTrangThai.drawio</w:t>
             </w:r>
           </w:p>
@@ -5802,7 +5855,7 @@
           <w:color w:val="595959"/>
           <w:sz w:val="22"/>
         </w:rPr>
-        <w:t>Buổi học: 09/09/2026   ·   Khoảng thời gian: 09/09 – 15/09/2026   ·   Khối lượng: 5 commit, 55 tệp thay đổi, 3.449 dòng thêm mới</w:t>
+        <w:t>Buổi học: 09/09/2026   ·   Khoảng thời gian: 09/09 – 15/09/2026   ·   Khối lượng: 8 commit, 59 tệp thay đổi, 3.877 dòng thêm mới</w:t>
       </w:r>
     </w:p>
     <w:p>

</xml_diff>